<commit_message>
v1.9.0 补充：merge_refs 回读验证硬化（未通过即失败）+ SKILL/README/CHANGELOG 同步 merge 说明
</commit_message>
<xml_diff>
--- a/scripts/demo/文稿.docx
+++ b/scripts/demo/文稿.docx
@@ -100,7 +100,7 @@
         <w:ind w:left="420" w:hanging="420"/>
         <w:jc w:val="both"/>
       </w:pPr>
-      <w:bookmarkStart w:id="7" w:name="ref_devlin2019"/>
+      <w:bookmarkStart w:id="11" w:name="ref_devlin2019"/>
       <w:r>
         <w:rPr>
           <w:rFonts w:ascii="Times New Roman" w:hAnsi="Times New Roman" w:eastAsia="宋体"/>
@@ -136,14 +136,14 @@
         </w:rPr>
         <w:t>.</w:t>
       </w:r>
-      <w:bookmarkEnd w:id="7"/>
+      <w:bookmarkEnd w:id="11"/>
     </w:p>
     <w:p>
       <w:pPr>
         <w:ind w:left="420" w:hanging="420"/>
         <w:jc w:val="both"/>
       </w:pPr>
-      <w:bookmarkStart w:id="8" w:name="ref_vaswani2017"/>
+      <w:bookmarkStart w:id="12" w:name="ref_vaswani2017"/>
       <w:r>
         <w:rPr>
           <w:rFonts w:ascii="Times New Roman" w:hAnsi="Times New Roman" w:eastAsia="宋体"/>
@@ -179,7 +179,7 @@
         </w:rPr>
         <w:t>.</w:t>
       </w:r>
-      <w:bookmarkEnd w:id="8"/>
+      <w:bookmarkEnd w:id="12"/>
     </w:p>
   </w:body>
 </w:document>

</xml_diff>